<commit_message>
docs(guide): update business guide with public video link, 870+ test counts, and re-track generator
Replaces video placeholder with verified public Google Drive demo video URL. Standardizes test counts to 870+ automated tests across worked examples and audit tables. Re-tracks scripts/generate_guide_docx.py so the guide is fully reproducible. Keeps scripts/create_video.py local.
</commit_message>
<xml_diff>
--- a/docs/CatSight_Business_and_Domain_Guide.docx
+++ b/docs/CatSight_Business_and_Domain_Guide.docx
@@ -35,7 +35,7 @@
         <w:br/>
         <w:t>Live URL: https://catsight-api-342162443546.us-central1.run.app | Code: https://github.com/venketraj/catsight-ai-buildercup-2026</w:t>
         <w:br/>
-        <w:t>Demo Video (&lt; 3 min): [VIDEO_LINK_PLACEHOLDER — Insert Public YouTube / Demo Video URL (&lt; 3:00)]</w:t>
+        <w:t>Demo Video (&lt; 3 min): https://drive.google.com/file/d/14Yv-A-KtVksOgRxOxafZcEKFBUvFumQi/view?usp=sharing</w:t>
       </w:r>
     </w:p>
     <w:tbl>
@@ -75,7 +75,7 @@
               <w:rPr>
                 <w:sz w:val="21"/>
               </w:rPr>
-              <w:t>This guide translates the entire CatSight project (synced to the final submission build, 874 automated tests, and 14-slide official AI Builder Cup submission deck) into everyday business language. It demystifies every reinsurance formula, explains why primary insurers and reinsurers argue over millions of dollars after natural disasters, and shows how CatSight delivers a verified portfolio view in 0.7–1.0 seconds (math) and ~10–12 seconds p50 (full AI wording check).</w:t>
+              <w:t>This guide translates the entire CatSight project (synced to the final submission build, 870+ automated tests, and 14-slide official AI Builder Cup submission deck) into everyday business language. It demystifies every reinsurance formula, explains why primary insurers and reinsurers argue over millions of dollars after natural disasters, and shows how CatSight delivers a verified portfolio view in 0.7–1.0 seconds (math) and ~10–12 seconds p50 (full AI wording check).</w:t>
             </w:r>
           </w:p>
         </w:tc>
@@ -1511,7 +1511,7 @@
         <w:rPr>
           <w:i w:val="0"/>
         </w:rPr>
-        <w:t>Every money figure in CatSight comes from deterministic Python using exact Decimal math (874 automated tests: 861 unit + 13 live). Here are the two core worked examples from our documentation (`docs/DOMAIN_PRIMER.md` and `docs/MONEY_MOMENT.md`):</w:t>
+        <w:t>Every money figure in CatSight comes from deterministic Python using exact Decimal math (870+ automated tests: 870+ offline + 13 opt-in live). Here are the two core worked examples from our documentation (`docs/DOMAIN_PRIMER.md` and `docs/MONEY_MOMENT.md`):</w:t>
       </w:r>
     </w:p>
     <w:p>
@@ -3166,7 +3166,7 @@
               <w:rPr>
                 <w:sz w:val="19"/>
               </w:rPr>
-              <w:t>874 automated tests (`Decimal` half-up; 861 unit + 13 live)</w:t>
+              <w:t>870+ automated tests (`Decimal` half-up; 870+ offline + 13 opt-in live)</w:t>
             </w:r>
           </w:p>
         </w:tc>

</xml_diff>

<commit_message>
fix(ops, replays, docs): chmod +x setup scripts, enforce report caveat check, and standardize counts
1. Sets mode +x (100755) on scripts/setup_model_armor.sh and setup_observability.sh so Cloud Shell execution succeeds.
2. Standardizes test counts to '870+ offline tests + 13 opt-in live tests' across ARCHITECTURE.md and the business guide.
3. Aligns hagibis-2019 report caveat text and requires strict verification count matching in test_replay.py (assert m_rpt).
4. Updates generate_guide_docx.py to use ROOT Path without hardcoded drive letters, writes directly to main docx, and documents scratch/ image source.
5. Tracks scripts/create_video.py to prove demo video authenticity and satisfy build_deck.py reference.
</commit_message>
<xml_diff>
--- a/docs/CatSight_Business_and_Domain_Guide.docx
+++ b/docs/CatSight_Business_and_Domain_Guide.docx
@@ -75,7 +75,7 @@
               <w:rPr>
                 <w:sz w:val="21"/>
               </w:rPr>
-              <w:t>This guide translates the entire CatSight project (synced to the final submission build, 870+ automated tests, and 14-slide official AI Builder Cup submission deck) into everyday business language. It demystifies every reinsurance formula, explains why primary insurers and reinsurers argue over millions of dollars after natural disasters, and shows how CatSight delivers a verified portfolio view in 0.7–1.0 seconds (math) and ~10–12 seconds p50 (full AI wording check).</w:t>
+              <w:t>This guide translates the entire CatSight project (synced to the final submission build, 870+ offline tests + 13 opt-in live tests, and 14-slide official AI Builder Cup submission deck) into everyday business language. It demystifies every reinsurance formula, explains why primary insurers and reinsurers argue over millions of dollars after natural disasters, and shows how CatSight delivers a verified portfolio view in 0.7–1.0 seconds (math) and ~10–12 seconds p50 (full AI wording check).</w:t>
             </w:r>
           </w:p>
         </w:tc>
@@ -1511,7 +1511,7 @@
         <w:rPr>
           <w:i w:val="0"/>
         </w:rPr>
-        <w:t>Every money figure in CatSight comes from deterministic Python using exact Decimal math (870+ automated tests: 870+ offline + 13 opt-in live). Here are the two core worked examples from our documentation (`docs/DOMAIN_PRIMER.md` and `docs/MONEY_MOMENT.md`):</w:t>
+        <w:t>Every money figure in CatSight comes from deterministic Python using exact Decimal math (870+ offline tests + 13 opt-in live tests). Here are the two core worked examples from our documentation (`docs/DOMAIN_PRIMER.md` and `docs/MONEY_MOMENT.md`):</w:t>
       </w:r>
     </w:p>
     <w:p>
@@ -3166,7 +3166,7 @@
               <w:rPr>
                 <w:sz w:val="19"/>
               </w:rPr>
-              <w:t>870+ automated tests (`Decimal` half-up; 870+ offline + 13 opt-in live)</w:t>
+              <w:t>870+ offline tests + 13 opt-in live tests (`Decimal` half-up)</w:t>
             </w:r>
           </w:p>
         </w:tc>

</xml_diff>

<commit_message>
docs(review): address end-to-end review feedback across README, deck, guide, and impact analysis
- F1: Rephrase Courtroom row in README, deck slide 11, and guide docx to state that Courtroom ran in 8 of 10 live analyses (skipped in 2 when verifier withheld T-004 flag), with both sides verified in all 8.
- F2: Update deck slide 3 box to state Clause Courtroom prices both readings "in about 8 s (p50)".
- F3: Update deck slide 2 to state CatSight tells a reinsurer "in about 11 seconds (p50)".
- F4: Update deck slide 6 funnel chip from "100% Quote Guardrail" to "Every quote checked".
- F5: Update docs/BUSINESS_IMPACT.md line 67 to 10-run figures from latest.json: 11.3 s p50 (7.8–19.3 s).
- F6: Add three explicit limitations bullets to README.md covering per-instance rate limiter scope, login-less analyst position recording, and preloaded events scope.
- Rebuild docs/CatSight_deck.pdf and docs/CatSight_Business_and_Domain_Guide.docx.
</commit_message>
<xml_diff>
--- a/docs/CatSight_Business_and_Domain_Guide.docx
+++ b/docs/CatSight_Business_and_Domain_Guide.docx
@@ -3427,7 +3427,7 @@
               <w:rPr>
                 <w:sz w:val="19"/>
               </w:rPr>
-              <w:t>8.0 s p50 · $0.0052 p50 (8/8 verified)</w:t>
+              <w:t>8.0 s p50 · $0.0052 p50</w:t>
             </w:r>
           </w:p>
         </w:tc>
@@ -3450,7 +3450,7 @@
               <w:rPr>
                 <w:sz w:val="19"/>
               </w:rPr>
-              <w:t>Parallel counsel on 3.5 Flash-Lite, Arbiter on 3.8 Flash; 8 of 8 verified</w:t>
+              <w:t>Ran in 8 of 10 live analyses (skipped in 2 when the verifier withheld the T-004 flag); both sides verified in all 8.</w:t>
             </w:r>
           </w:p>
         </w:tc>

</xml_diff>